<commit_message>
feat: centralize Chinese business language
</commit_message>
<xml_diff>
--- a/samples/2026-07-ai-lab-monthly-report.docx
+++ b/samples/2026-07-ai-lab-monthly-report.docx
@@ -198,7 +198,7 @@
                 <w:sz w:val="17"/>
                 <w:szCs w:val="17"/>
               </w:rPr>
-              <w:t>Algorithm Lead</w:t>
+              <w:t>算法负责人</w:t>
             </w:r>
           </w:p>
         </w:tc>
@@ -248,7 +248,7 @@
                 <w:sz w:val="17"/>
                 <w:szCs w:val="17"/>
               </w:rPr>
-              <w:t>CALIBRATED</w:t>
+              <w:t>已校准</w:t>
             </w:r>
           </w:p>
         </w:tc>
@@ -275,7 +275,7 @@
                 <w:sz w:val="17"/>
                 <w:szCs w:val="17"/>
               </w:rPr>
-              <w:t>Platform Lead</w:t>
+              <w:t>平台负责人</w:t>
             </w:r>
           </w:p>
         </w:tc>
@@ -325,7 +325,7 @@
                 <w:sz w:val="17"/>
                 <w:szCs w:val="17"/>
               </w:rPr>
-              <w:t>CALIBRATED</w:t>
+              <w:t>已校准</w:t>
             </w:r>
           </w:p>
         </w:tc>
@@ -352,7 +352,7 @@
                 <w:sz w:val="17"/>
                 <w:szCs w:val="17"/>
               </w:rPr>
-              <w:t>Platform Engineer</w:t>
+              <w:t>平台工程师</w:t>
             </w:r>
           </w:p>
         </w:tc>
@@ -402,7 +402,7 @@
                 <w:sz w:val="17"/>
                 <w:szCs w:val="17"/>
               </w:rPr>
-              <w:t>PENDING</w:t>
+              <w:t>待确认</w:t>
             </w:r>
           </w:p>
         </w:tc>
@@ -432,7 +432,7 @@
           <w:sz w:val="21"/>
           <w:szCs w:val="21"/>
         </w:rPr>
-        <w:t>Build dependable AI platform · 62% · Platform and model work in progress</w:t>
+        <w:t>建设稳定可靠的人工智能平台 · 62% · 平台与模型能力持续建设中</w:t>
       </w:r>
     </w:p>
     <w:p>
@@ -459,9 +459,9 @@
           <w:sz w:val="21"/>
           <w:szCs w:val="21"/>
         </w:rPr>
-        <w:t>July performance calibration completed
-Delivery evidence and cross-line reviews were closed
-Prepare Q3 milestone execution</w:t>
+        <w:t>七月绩效校准已完成
+交付证据和跨业务线评审已闭环
+推进三季度里程碑执行</w:t>
       </w:r>
     </w:p>
     <w:p>

</xml_diff>